<commit_message>
docs: update report after repository rename and PR checks
</commit_message>
<xml_diff>
--- a/lab3/Дедкова_А, Генне_К, Маракулин_А.docx
+++ b/lab3/Дедкова_А, Генне_К, Маракулин_А.docx
@@ -5991,7 +5991,7 @@
         <w:rPr/>
       </w:pPr>
       <w:r>
-        <w:t>Для лабораторной использован существующий публичный репозиторий ProjectDocumentation в аккаунте MrMegnis: https://github.com/MrMegnis/ProjectDocumentation. Проект стайлгайда размещён в каталоге style-guide-project/. В ветке main находятся конфигурация MkDocs, руководство по внесению изменений и семь исходных страниц стайлгайда. Репозиторий MenshikovAI использован как источник контекста о программном продукте.</w:t>
+        <w:t>Материалы лабораторной размещены в публичном репозитории style-guide-project аккаунта MrMegnis: https://github.com/MrMegnis/style-guide-project. Проект стайлгайда находится в одноимённом каталоге style-guide-project/. В ветке main находятся конфигурация MkDocs, руководство по внесению изменений, семь исходных страниц стайлгайда и конфигурация автоматических проверок. Репозиторий MenshikovAI использован как источник контекста о программном продукте.</w:t>
       </w:r>
     </w:p>
     <w:p>
@@ -6048,7 +6048,7 @@
         <w:rPr/>
       </w:pPr>
       <w:r>
-        <w:t>Рисунок 1 – Репозиторий ProjectDocumentation на GitHub</w:t>
+        <w:t>Рисунок 1 – Репозиторий style-guide-project на GitHub</w:t>
       </w:r>
     </w:p>
     <w:p>
@@ -6974,7 +6974,7 @@
     <w:p>
       <w:pPr/>
       <w:r>
-        <w:t>Для ветки codex/accessibility открыт Pull Request № 1 «Добавить раздел «Доступность текста»»: https://github.com/MrMegnis/ProjectDocumentation/pull/1. В нём изменены только style-guide-project/docs/accessibility.md и style-guide-project/mkdocs.yml. Ревью запрошено у AnastasyaDedkova.</w:t>
+        <w:t>Для ветки codex/accessibility открыт Pull Request № 1 «Добавить раздел «Доступность текста»»: https://github.com/MrMegnis/style-guide-project/pull/1. В нём изменены только style-guide-project/docs/accessibility.md и style-guide-project/mkdocs.yml. Ревью запрошено у AnastasyaDedkova. После повторного открытия PR автоматически запустились проверки Docs и Lint Markdown; обе завершились успешно.</w:t>
       </w:r>
     </w:p>
     <w:p>
@@ -7019,7 +7019,7 @@
     <w:p>
       <w:pPr/>
       <w:r>
-        <w:t>Рисунок 9 – Pull Request для раздела доступности</w:t>
+        <w:t>Рисунок 9 – Pull Request № 1 с результатами проверок Actions</w:t>
       </w:r>
     </w:p>
     <w:p>
@@ -7115,7 +7115,7 @@
     <w:p>
       <w:pPr/>
       <w:r>
-        <w:t>После слияния необходимо проверить обновление опубликованного сайта. Эта проверка зависит от настройки автоматической публикации в пункте 10.</w:t>
+        <w:t>После слияния Pull Request необходимо проверить обновление опубликованного сайта через workflow Docs и сохранить скрин страницы с новым разделом. Публикация из Pull Request не выполняется: шаг deploy запускается только для ветки main.</w:t>
       </w:r>
     </w:p>
     <w:p>
@@ -7243,7 +7243,7 @@
         <w:rPr/>
       </w:pPr>
       <w:r>
-        <w:t>Стайлгайд оформлен как Docs as Code-проект на MkDocs. Созданы семь страниц руководства, `CONTRIBUTING.md` и отдельный Pull Request для раздела доступности. Локальная строгая сборка MkDocs завершилась успешно. Результаты линтинга, CI/CD, взаимного ревью, слияния и автоматической публикации следует внести после выполнения соответствующих этапов.</w:t>
+        <w:t>Стайлгайд оформлен как Docs as Code-проект на MkDocs. Созданы семь страниц руководства, CONTRIBUTING.md и отдельный Pull Request для раздела доступности. Локальная строгая сборка MkDocs завершилась успешно. В репозитории настроены линтинг и CI/CD; результаты их проверок необходимо описать в пунктах 9–10. Результаты взаимного ревью, слияния и автоматической публикации следует внести после выполнения этих этапов.</w:t>
       </w:r>
     </w:p>
     <w:p>

</xml_diff>

<commit_message>
docs: record accessibility review and follow-up
</commit_message>
<xml_diff>
--- a/lab3/Дедкова_А, Генне_К, Маракулин_А.docx
+++ b/lab3/Дедкова_А, Генне_К, Маракулин_А.docx
@@ -6601,7 +6601,7 @@
         <w:rPr/>
       </w:pPr>
       <w:r>
-        <w:t>В отдельной ветке добавлен файл style-guide-project/docs/accessibility.md с новым сквозным разделом «Доступность текста». Он применяется ко всей технической документации MenshikovAI. В раздел перенесены правила, подготовленные для пункта 11.2 задания.</w:t>
+        <w:t>В отдельной ветке добавлен файл style-guide-project/docs/accessibility.md с новым сквозным разделом «Доступность текста». Он применяется ко всей технической документации проекта «Telegram-бот MenshikovAI». В раздел перенесены правила, подготовленные для пункта 11.2 задания, и уточнения по результатам ревью.</w:t>
       </w:r>
     </w:p>
     <w:p>
@@ -6695,6 +6695,11 @@
       </w:r>
     </w:p>
     <w:p>
+      <w:r>
+        <w:t>5) Каждый рисунок, таблица и листинг должны сопровождаться информативной подписью, которая кратко и однозначно отражает их содержание. Не допускаются слишком общие подписи, например «Схема», «Таблица» или «Пример кода», без уточнения назначения соответствующего элемента.</w:t>
+      </w:r>
+    </w:p>
+    <w:p>
       <w:pPr>
         <w:pStyle w:val="Heading3"/>
       </w:pPr>
@@ -6723,7 +6728,7 @@
     <w:p>
       <w:pPr/>
       <w:r>
-        <w:t>4) Не следует создавать слишком сложные таблицы с большим количеством вложенных данных, если ту же информацию можно представить несколькими отдельными блоками.</w:t>
+        <w:t>4) Если в ячейках появляются несколько абзацев или вложенные списки, информацию следует разделить на отдельные блоки.</w:t>
       </w:r>
     </w:p>
     <w:p>
@@ -6743,7 +6748,7 @@
     <w:p>
       <w:pPr/>
       <w:r>
-        <w:t>1) Одно предложение должно передавать одну основную мысль.</w:t>
+        <w:t>1) Один абзац должен раскрывать одну основную мысль.</w:t>
       </w:r>
     </w:p>
     <w:p>
@@ -7043,7 +7048,52 @@
     <w:p>
       <w:pPr/>
       <w:r>
-        <w:t>Ссылка на Pull Request партнёра и три комментария к нему будут добавлены после публикации его изменений и проведения взаимного ревью. Ревью собственного Pull Request запрошено у AnastasyaDedkova.</w:t>
+        <w:t>Ревью собственного Pull Request запрошено у AnastasyaDedkova. Она оставила четыре замечания к формулировкам раздела «Доступность текста». Ссылка на Pull Request партнёра и три комментария к нему будут добавлены после публикации его изменений и проведения взаимного ревью.</w:t>
+      </w:r>
+    </w:p>
+    <w:p>
+      <w:pPr>
+        <w:keepNext/>
+        <w:jc w:val="center"/>
+      </w:pPr>
+      <w:r>
+        <w:drawing>
+          <wp:inline>
+            <wp:extent cx="5029200" cy="2830665"/>
+            <wp:docPr id="12" name="Picture 12"/>
+            <wp:cNvGraphicFramePr>
+              <a:graphicFrameLocks noChangeAspect="1"/>
+            </wp:cNvGraphicFramePr>
+            <a:graphic>
+              <a:graphicData uri="http://schemas.openxmlformats.org/drawingml/2006/picture">
+                <pic:pic>
+                  <pic:nvPicPr>
+                    <pic:cNvPr id="0" name="review-comments.png"/>
+                    <pic:cNvPicPr/>
+                  </pic:nvPicPr>
+                  <pic:blipFill>
+                    <a:blip r:embed="rId19"/>
+                    <a:stretch>
+                      <a:fillRect/>
+                    </a:stretch>
+                  </pic:blipFill>
+                  <pic:spPr>
+                    <a:xfrm>
+                      <a:off x="0" y="0"/>
+                      <a:ext cx="5029200" cy="2830665"/>
+                    </a:xfrm>
+                    <a:prstGeom prst="rect"/>
+                  </pic:spPr>
+                </pic:pic>
+              </a:graphicData>
+            </a:graphic>
+          </wp:inline>
+        </w:drawing>
+      </w:r>
+    </w:p>
+    <w:p>
+      <w:r>
+        <w:t>Рисунок 10 – Четыре замечания Анастасии к Pull Request № 1</w:t>
       </w:r>
     </w:p>
     <w:p>
@@ -7067,7 +7117,52 @@
     <w:p>
       <w:pPr/>
       <w:r>
-        <w:t>Повторный коммит будет сделан после получения и обработки замечаний к Pull Request № 1.</w:t>
+        <w:t>Все четыре замечания учтены в файле accessibility.md: уточнено первое упоминание названия проекта, добавлено правило для подписей, конкретизировано условие разделения сложных таблиц и исправлено правило о смысловой целостности абзаца. Изменения отправлены в ветку codex/accessibility повторным коммитом 767f957 (docs: address accessibility review feedback). Строгая сборка MkDocs и обе проверки GitHub Actions прошли успешно. Ревьюера попросили повторно проверить PR; слияние пока не выполнялось.</w:t>
+      </w:r>
+    </w:p>
+    <w:p>
+      <w:pPr>
+        <w:keepNext/>
+        <w:jc w:val="center"/>
+      </w:pPr>
+      <w:r>
+        <w:drawing>
+          <wp:inline>
+            <wp:extent cx="5029200" cy="2830665"/>
+            <wp:docPr id="13" name="Picture 13"/>
+            <wp:cNvGraphicFramePr>
+              <a:graphicFrameLocks noChangeAspect="1"/>
+            </wp:cNvGraphicFramePr>
+            <a:graphic>
+              <a:graphicData uri="http://schemas.openxmlformats.org/drawingml/2006/picture">
+                <pic:pic>
+                  <pic:nvPicPr>
+                    <pic:cNvPr id="0" name="repeat-commit.png"/>
+                    <pic:cNvPicPr/>
+                  </pic:nvPicPr>
+                  <pic:blipFill>
+                    <a:blip r:embed="rId20"/>
+                    <a:stretch>
+                      <a:fillRect/>
+                    </a:stretch>
+                  </pic:blipFill>
+                  <pic:spPr>
+                    <a:xfrm>
+                      <a:off x="0" y="0"/>
+                      <a:ext cx="5029200" cy="2830665"/>
+                    </a:xfrm>
+                    <a:prstGeom prst="rect"/>
+                  </pic:spPr>
+                </pic:pic>
+              </a:graphicData>
+            </a:graphic>
+          </wp:inline>
+        </w:drawing>
+      </w:r>
+    </w:p>
+    <w:p>
+      <w:r>
+        <w:t>Рисунок 11 – Повторный коммит 767f957 с исправлениями по замечаниям</w:t>
       </w:r>
     </w:p>
     <w:p>
@@ -7194,7 +7289,7 @@
     <w:p>
       <w:pPr/>
       <w:r>
-        <w:t>Рисунок 10 – Файл style-guide-project/CONTRIBUTING.md в репозитории</w:t>
+        <w:t>Рисунок 12 – Файл style-guide-project/CONTRIBUTING.md в репозитории</w:t>
       </w:r>
     </w:p>
     <w:p>
@@ -7243,7 +7338,7 @@
         <w:rPr/>
       </w:pPr>
       <w:r>
-        <w:t>Стайлгайд оформлен как Docs as Code-проект на MkDocs. Созданы семь страниц руководства, CONTRIBUTING.md и отдельный Pull Request для раздела доступности. Локальная строгая сборка MkDocs завершилась успешно. В репозитории настроены линтинг и CI/CD; результаты их проверок необходимо описать в пунктах 9–10. Результаты взаимного ревью, слияния и автоматической публикации следует внести после выполнения этих этапов.</w:t>
+        <w:t>Стайлгайд оформлен как Docs as Code-проект на MkDocs. Созданы семь страниц руководства, CONTRIBUTING.md и отдельный Pull Request для раздела доступности. После замечаний ревьюера внесены исправления повторным коммитом; строгая сборка MkDocs и проверки GitHub Actions прошли успешно. В репозитории настроены линтинг и CI/CD; их реализацию необходимо описать в пунктах 9–10. Результаты ревью PR партнёра, слияния и автоматической публикации следует внести после выполнения этих этапов.</w:t>
       </w:r>
     </w:p>
     <w:p>
@@ -7257,7 +7352,7 @@
         </w:rPr>
       </w:pPr>
       <w:r>
-        <w:t>Репозиторий и Pull Request доступны по ссылкам в пунктах 6 и 11. Подтверждения созданных файлов, навигации сайта, ветки и первого коммита приведены на рисунках. Результаты обмена ревью, повторного коммита, слияния и опубликованного сайта дополняются после их фактического выполнения.</w:t>
+        <w:t>Репозиторий и Pull Request доступны по ссылкам в пунктах 6 и 11. Подтверждения созданных файлов, навигации сайта, ветки, первого коммита, замечаний и повторного коммита приведены на рисунках. Результаты ревью PR партнёра, слияния и обновления опубликованного сайта дополняются после их фактического выполнения.</w:t>
       </w:r>
     </w:p>
     <w:p>

</xml_diff>